<commit_message>
Redraw manuscript figures with Python and preserve editable sources
</commit_message>
<xml_diff>
--- a/manuscript/Annual_ST_Manuscript.docx
+++ b/manuscript/Annual_ST_Manuscript.docx
@@ -1067,7 +1067,7 @@
       <w:r>
         <w:drawing>
           <wp:inline xmlns:a="http://schemas.openxmlformats.org/drawingml/2006/main" xmlns:pic="http://schemas.openxmlformats.org/drawingml/2006/picture">
-            <wp:extent cx="5832000" cy="2841337"/>
+            <wp:extent cx="5832000" cy="2874343"/>
             <wp:docPr id="1" name="Picture 1"/>
             <wp:cNvGraphicFramePr>
               <a:graphicFrameLocks noChangeAspect="1"/>
@@ -1088,7 +1088,7 @@
                   <pic:spPr>
                     <a:xfrm>
                       <a:off x="0" y="0"/>
-                      <a:ext cx="5832000" cy="2841337"/>
+                      <a:ext cx="5832000" cy="2874343"/>
                     </a:xfrm>
                     <a:prstGeom prst="rect"/>
                   </pic:spPr>
@@ -2125,7 +2125,7 @@
       <w:r>
         <w:drawing>
           <wp:inline xmlns:a="http://schemas.openxmlformats.org/drawingml/2006/main" xmlns:pic="http://schemas.openxmlformats.org/drawingml/2006/picture">
-            <wp:extent cx="5832000" cy="2841337"/>
+            <wp:extent cx="5832000" cy="2916000"/>
             <wp:docPr id="2" name="Picture 2"/>
             <wp:cNvGraphicFramePr>
               <a:graphicFrameLocks noChangeAspect="1"/>
@@ -2146,7 +2146,7 @@
                   <pic:spPr>
                     <a:xfrm>
                       <a:off x="0" y="0"/>
-                      <a:ext cx="5832000" cy="2841337"/>
+                      <a:ext cx="5832000" cy="2916000"/>
                     </a:xfrm>
                     <a:prstGeom prst="rect"/>
                   </pic:spPr>
@@ -4261,7 +4261,7 @@
       <w:r>
         <w:drawing>
           <wp:inline xmlns:a="http://schemas.openxmlformats.org/drawingml/2006/main" xmlns:pic="http://schemas.openxmlformats.org/drawingml/2006/picture">
-            <wp:extent cx="5400000" cy="4343325"/>
+            <wp:extent cx="5400000" cy="3934286"/>
             <wp:docPr id="3" name="Picture 3"/>
             <wp:cNvGraphicFramePr>
               <a:graphicFrameLocks noChangeAspect="1"/>
@@ -4282,7 +4282,7 @@
                   <pic:spPr>
                     <a:xfrm>
                       <a:off x="0" y="0"/>
-                      <a:ext cx="5400000" cy="4343325"/>
+                      <a:ext cx="5400000" cy="3934286"/>
                     </a:xfrm>
                     <a:prstGeom prst="rect"/>
                   </pic:spPr>
@@ -5807,7 +5807,7 @@
       <w:r>
         <w:drawing>
           <wp:inline xmlns:a="http://schemas.openxmlformats.org/drawingml/2006/main" xmlns:pic="http://schemas.openxmlformats.org/drawingml/2006/picture">
-            <wp:extent cx="5832000" cy="2784375"/>
+            <wp:extent cx="5832000" cy="3165943"/>
             <wp:docPr id="4" name="Picture 4"/>
             <wp:cNvGraphicFramePr>
               <a:graphicFrameLocks noChangeAspect="1"/>
@@ -5828,7 +5828,7 @@
                   <pic:spPr>
                     <a:xfrm>
                       <a:off x="0" y="0"/>
-                      <a:ext cx="5832000" cy="2784375"/>
+                      <a:ext cx="5832000" cy="3165943"/>
                     </a:xfrm>
                     <a:prstGeom prst="rect"/>
                   </pic:spPr>
@@ -5854,7 +5854,7 @@
           <w:color w:val="000000"/>
           <w:sz w:val="18"/>
         </w:rPr>
-        <w:t>Source: Saved predictions. Neural seeds 17 solid, 42 dashed and 2026 dotted; logistic is black. The PR reference is prevalence, 11/216.</w:t>
+        <w:t>Source: Saved predictions. Line patterns identify models; grey tones identify neural seeds 17, 42 and 2026. All runs are shown. The PR reference is prevalence, 11/216.</w:t>
       </w:r>
     </w:p>
     <w:p>
@@ -6763,7 +6763,7 @@
       <w:r>
         <w:drawing>
           <wp:inline xmlns:a="http://schemas.openxmlformats.org/drawingml/2006/main" xmlns:pic="http://schemas.openxmlformats.org/drawingml/2006/picture">
-            <wp:extent cx="5400000" cy="4596077"/>
+            <wp:extent cx="5400000" cy="4705714"/>
             <wp:docPr id="5" name="Picture 5"/>
             <wp:cNvGraphicFramePr>
               <a:graphicFrameLocks noChangeAspect="1"/>
@@ -6784,7 +6784,7 @@
                   <pic:spPr>
                     <a:xfrm>
                       <a:off x="0" y="0"/>
-                      <a:ext cx="5400000" cy="4596077"/>
+                      <a:ext cx="5400000" cy="4705714"/>
                     </a:xfrm>
                     <a:prstGeom prst="rect"/>
                   </pic:spPr>

</xml_diff>

<commit_message>
Check reference links and align manuscript captions with FIQ template
</commit_message>
<xml_diff>
--- a/manuscript/Annual_ST_Manuscript.docx
+++ b/manuscript/Annual_ST_Manuscript.docx
@@ -67,12 +67,18 @@
       <w:r>
         <w:rPr>
           <w:rFonts w:ascii="Times New Roman" w:hAnsi="Times New Roman"/>
+          <w:b/>
+          <w:sz w:val="20"/>
+        </w:rPr>
+        <w:t>JEL classification:</w:t>
+      </w:r>
+      <w:r>
+        <w:rPr>
+          <w:rFonts w:ascii="Times New Roman" w:hAnsi="Times New Roman"/>
           <w:b w:val="0"/>
-          <w:i w:val="0"/>
-          <w:color w:val="000000"/>
           <w:sz w:val="20"/>
         </w:rPr>
-        <w:t>JEL classification: C45, C53, G32, G33</w:t>
+        <w:t xml:space="preserve"> C45, C53, G32, G33</w:t>
       </w:r>
     </w:p>
     <w:p>
@@ -85,12 +91,18 @@
       <w:r>
         <w:rPr>
           <w:rFonts w:ascii="Times New Roman" w:hAnsi="Times New Roman"/>
+          <w:b/>
+          <w:sz w:val="20"/>
+        </w:rPr>
+        <w:t>Keywords:</w:t>
+      </w:r>
+      <w:r>
+        <w:rPr>
+          <w:rFonts w:ascii="Times New Roman" w:hAnsi="Times New Roman"/>
           <w:b w:val="0"/>
-          <w:i w:val="0"/>
-          <w:color w:val="000000"/>
           <w:sz w:val="20"/>
         </w:rPr>
-        <w:t>Keywords: ST risk; financial distress prediction; logistic regression; annual reports; multimodal learning; early warning</w:t>
+        <w:t xml:space="preserve"> ST risk; financial distress prediction; logistic regression; annual reports; multimodal learning; early warning</w:t>
       </w:r>
     </w:p>
     <w:p>
@@ -254,7 +266,7 @@
           <w:color w:val="000000"/>
           <w:sz w:val="24"/>
         </w:rPr>
-        <w:t>Text research provides several routes to measuring corporate information. Loughran and McDonald (2011, Abstract, para. 1) show why general-purpose negative-word dictionaries can misclassify financial language, while Kogan, Levin, Routledge, Sagi and Smith (2009, p. 272) study future stock-return volatility using financial-report text. Mai, Tian, Lee and Ma (2019, p. 743) and Matin, Hansen, Hansen and Mølgaard (2018, p. 1) investigate deep textual representations for bankruptcy or distress prediction. These studies motivate testing narrative information; their reported performance cannot be transferred to a different endpoint, language, sample or validation design.</w:t>
+        <w:t>Text research provides several routes to measuring corporate information. Loughran and McDonald (2011, p. 35) show why general-purpose negative-word dictionaries can misclassify financial language, while Kogan, Levin, Routledge, Sagi and Smith (2009, p. 272) study future stock-return volatility using financial-report text. Mai, Tian, Lee and Ma (2019, p. 743) and Matin, Hansen, Hansen and Mølgaard (2018, p. 1) investigate deep textual representations for bankruptcy or distress prediction. These studies motivate testing narrative information; their reported performance cannot be transferred to a different endpoint, language, sample or validation design.</w:t>
       </w:r>
     </w:p>
     <w:p>
@@ -416,7 +428,7 @@
           <w:b/>
           <w:i w:val="0"/>
           <w:color w:val="000000"/>
-          <w:sz w:val="20"/>
+          <w:sz w:val="22"/>
         </w:rPr>
         <w:t>Table 1: Common sample by chronological partition</w:t>
       </w:r>
@@ -1009,7 +1021,7 @@
         <w:keepNext w:val="0"/>
         <w:widowControl/>
         <w:spacing w:after="120" w:before="0" w:line="240" w:lineRule="auto"/>
-        <w:jc w:val="left"/>
+        <w:jc w:val="center"/>
       </w:pPr>
       <w:r>
         <w:rPr>
@@ -1017,7 +1029,7 @@
           <w:b w:val="0"/>
           <w:i/>
           <w:color w:val="000000"/>
-          <w:sz w:val="18"/>
+          <w:sz w:val="22"/>
         </w:rPr>
         <w:t>Source: Version 2 input manifest. Total unique firms = 155; firms may occur in more than one partition.</w:t>
       </w:r>
@@ -1053,7 +1065,7 @@
           <w:b/>
           <w:i w:val="0"/>
           <w:color w:val="000000"/>
-          <w:sz w:val="20"/>
+          <w:sz w:val="22"/>
         </w:rPr>
         <w:t>Figure 1: Source inventory and chronological evaluation</w:t>
       </w:r>
@@ -1104,7 +1116,7 @@
         <w:keepNext w:val="0"/>
         <w:widowControl/>
         <w:spacing w:after="120" w:before="0" w:line="240" w:lineRule="auto"/>
-        <w:jc w:val="left"/>
+        <w:jc w:val="center"/>
       </w:pPr>
       <w:r>
         <w:rPr>
@@ -1112,7 +1124,7 @@
           <w:b w:val="0"/>
           <w:i/>
           <w:color w:val="000000"/>
-          <w:sz w:val="18"/>
+          <w:sz w:val="22"/>
         </w:rPr>
         <w:t>Source: Version 2 manifest and candidate decision inventory.</w:t>
       </w:r>
@@ -1167,7 +1179,7 @@
           <w:b/>
           <w:i w:val="0"/>
           <w:color w:val="000000"/>
-          <w:sz w:val="20"/>
+          <w:sz w:val="22"/>
         </w:rPr>
         <w:t>Table 2: Annual financial ratios</w:t>
       </w:r>
@@ -1958,7 +1970,7 @@
         <w:keepNext w:val="0"/>
         <w:widowControl/>
         <w:spacing w:after="120" w:before="0" w:line="240" w:lineRule="auto"/>
-        <w:jc w:val="left"/>
+        <w:jc w:val="center"/>
       </w:pPr>
       <w:r>
         <w:rPr>
@@ -1966,7 +1978,7 @@
           <w:b w:val="0"/>
           <w:i/>
           <w:color w:val="000000"/>
-          <w:sz w:val="18"/>
+          <w:sz w:val="22"/>
         </w:rPr>
         <w:t>Source: Annual feature protocol. Stock denominators are year-end balances; ratios are dimensionless. Zero denominators produce missing values.</w:t>
       </w:r>
@@ -2111,7 +2123,7 @@
           <w:b/>
           <w:i w:val="0"/>
           <w:color w:val="000000"/>
-          <w:sz w:val="20"/>
+          <w:sz w:val="22"/>
         </w:rPr>
         <w:t>Figure 2: Financial-query cross-attention over MD&amp;A chunks</w:t>
       </w:r>
@@ -2162,7 +2174,7 @@
         <w:keepNext w:val="0"/>
         <w:widowControl/>
         <w:spacing w:after="120" w:before="0" w:line="240" w:lineRule="auto"/>
-        <w:jc w:val="left"/>
+        <w:jc w:val="center"/>
       </w:pPr>
       <w:r>
         <w:rPr>
@@ -2170,7 +2182,7 @@
           <w:b w:val="0"/>
           <w:i/>
           <w:color w:val="000000"/>
-          <w:sz w:val="18"/>
+          <w:sz w:val="22"/>
         </w:rPr>
         <w:t>Source: Implemented annual model. Concatenation uses mean-pooled text; both fusion models contain 30,721 parameters.</w:t>
       </w:r>
@@ -2371,7 +2383,7 @@
           <w:b/>
           <w:i w:val="0"/>
           <w:color w:val="000000"/>
-          <w:sz w:val="20"/>
+          <w:sz w:val="22"/>
         </w:rPr>
         <w:t>Table 3: Raw training financial ratios</w:t>
       </w:r>
@@ -4221,7 +4233,7 @@
         <w:keepNext w:val="0"/>
         <w:widowControl/>
         <w:spacing w:after="120" w:before="0" w:line="240" w:lineRule="auto"/>
-        <w:jc w:val="left"/>
+        <w:jc w:val="center"/>
       </w:pPr>
       <w:r>
         <w:rPr>
@@ -4229,7 +4241,7 @@
           <w:b w:val="0"/>
           <w:i/>
           <w:color w:val="000000"/>
-          <w:sz w:val="18"/>
+          <w:sz w:val="22"/>
         </w:rPr>
         <w:t>Source: The unchanged 503 training records, before winsorization, imputation or scaling.</w:t>
       </w:r>
@@ -4247,7 +4259,7 @@
           <w:b/>
           <w:i w:val="0"/>
           <w:color w:val="000000"/>
-          <w:sz w:val="20"/>
+          <w:sz w:val="22"/>
         </w:rPr>
         <w:t>Figure 3: Common-observation training correlation matrix</w:t>
       </w:r>
@@ -4298,7 +4310,7 @@
         <w:keepNext w:val="0"/>
         <w:widowControl/>
         <w:spacing w:after="120" w:before="0" w:line="240" w:lineRule="auto"/>
-        <w:jc w:val="left"/>
+        <w:jc w:val="center"/>
       </w:pPr>
       <w:r>
         <w:rPr>
@@ -4306,7 +4318,7 @@
           <w:b w:val="0"/>
           <w:i/>
           <w:color w:val="000000"/>
-          <w:sz w:val="18"/>
+          <w:sz w:val="22"/>
         </w:rPr>
         <w:t>Source: Raw ratios for the same 503 complete training observations. Codes are defined in Table 2.</w:t>
       </w:r>
@@ -4361,7 +4373,7 @@
           <w:b/>
           <w:i w:val="0"/>
           <w:color w:val="000000"/>
-          <w:sz w:val="20"/>
+          <w:sz w:val="22"/>
         </w:rPr>
         <w:t>Table 4: Test ranking and event recall</w:t>
       </w:r>
@@ -5231,7 +5243,7 @@
         <w:keepNext w:val="0"/>
         <w:widowControl/>
         <w:spacing w:after="120" w:before="0" w:line="240" w:lineRule="auto"/>
-        <w:jc w:val="left"/>
+        <w:jc w:val="center"/>
       </w:pPr>
       <w:r>
         <w:rPr>
@@ -5239,7 +5251,7 @@
           <w:b w:val="0"/>
           <w:i/>
           <w:color w:val="000000"/>
-          <w:sz w:val="18"/>
+          <w:sz w:val="22"/>
         </w:rPr>
         <w:t>Source: 216 test records, 11 events. Logistic is one fit; neural entries are three-seed means. SD is across seeds; confidence intervals use 2,000 company-cluster draws. Recall uses validation-selected thresholds.</w:t>
       </w:r>
@@ -5293,7 +5305,7 @@
           <w:b/>
           <w:i w:val="0"/>
           <w:color w:val="000000"/>
-          <w:sz w:val="20"/>
+          <w:sz w:val="22"/>
         </w:rPr>
         <w:t>Table 5: Paired test AP differences</w:t>
       </w:r>
@@ -5749,7 +5761,7 @@
         <w:keepNext w:val="0"/>
         <w:widowControl/>
         <w:spacing w:after="120" w:before="0" w:line="240" w:lineRule="auto"/>
-        <w:jc w:val="left"/>
+        <w:jc w:val="center"/>
       </w:pPr>
       <w:r>
         <w:rPr>
@@ -5757,7 +5769,7 @@
           <w:b w:val="0"/>
           <w:i/>
           <w:color w:val="000000"/>
-          <w:sz w:val="18"/>
+          <w:sz w:val="22"/>
         </w:rPr>
         <w:t>Source: Identical company resamples across models, 2,000 valid draws. Intervals are conditional on fitted models and are not multiplicity-adjusted.</w:t>
       </w:r>
@@ -5793,7 +5805,7 @@
           <w:b/>
           <w:i w:val="0"/>
           <w:color w:val="000000"/>
-          <w:sz w:val="20"/>
+          <w:sz w:val="22"/>
         </w:rPr>
         <w:t>Figure 4: Test precision–recall and ROC curves</w:t>
       </w:r>
@@ -5844,7 +5856,7 @@
         <w:keepNext w:val="0"/>
         <w:widowControl/>
         <w:spacing w:after="120" w:before="0" w:line="240" w:lineRule="auto"/>
-        <w:jc w:val="left"/>
+        <w:jc w:val="center"/>
       </w:pPr>
       <w:r>
         <w:rPr>
@@ -5852,7 +5864,7 @@
           <w:b w:val="0"/>
           <w:i/>
           <w:color w:val="000000"/>
-          <w:sz w:val="18"/>
+          <w:sz w:val="22"/>
         </w:rPr>
         <w:t>Source: Saved predictions. Line patterns identify models; grey tones identify neural seeds 17, 42 and 2026. All runs are shown. The PR reference is prevalence, 11/216.</w:t>
       </w:r>
@@ -5999,7 +6011,7 @@
           <w:b/>
           <w:i w:val="0"/>
           <w:color w:val="000000"/>
-          <w:sz w:val="20"/>
+          <w:sz w:val="22"/>
         </w:rPr>
         <w:t>Table 6: Precision / recall at annual alert budgets</w:t>
       </w:r>
@@ -6705,7 +6717,7 @@
         <w:keepNext w:val="0"/>
         <w:widowControl/>
         <w:spacing w:after="120" w:before="0" w:line="240" w:lineRule="auto"/>
-        <w:jc w:val="left"/>
+        <w:jc w:val="center"/>
       </w:pPr>
       <w:r>
         <w:rPr>
@@ -6713,7 +6725,7 @@
           <w:b w:val="0"/>
           <w:i/>
           <w:color w:val="000000"/>
-          <w:sz w:val="18"/>
+          <w:sz w:val="22"/>
         </w:rPr>
         <w:t>Source: Saved test scores ranked separately within each year. Rounded-up annual selections give 11, 22 and 44 total alerts. Entries are precision / recall; neural entries average three runs.</w:t>
       </w:r>
@@ -6749,7 +6761,7 @@
           <w:b/>
           <w:i w:val="0"/>
           <w:color w:val="000000"/>
-          <w:sz w:val="20"/>
+          <w:sz w:val="22"/>
         </w:rPr>
         <w:t>Figure 5: Recorded neural optimization histories</w:t>
       </w:r>
@@ -6800,7 +6812,7 @@
         <w:keepNext w:val="0"/>
         <w:widowControl/>
         <w:spacing w:after="120" w:before="0" w:line="240" w:lineRule="auto"/>
-        <w:jc w:val="left"/>
+        <w:jc w:val="center"/>
       </w:pPr>
       <w:r>
         <w:rPr>
@@ -6808,7 +6820,7 @@
           <w:b w:val="0"/>
           <w:i/>
           <w:color w:val="000000"/>
-          <w:sz w:val="18"/>
+          <w:sz w:val="22"/>
         </w:rPr>
         <w:t>Source: Actual training loss and validation AP logs. Seeds 17 solid, 42 dashed and 2026 dotted. Validation loss was not recorded.</w:t>
       </w:r>
@@ -7016,13 +7028,19 @@
       <w:r>
         <w:rPr>
           <w:rFonts w:ascii="Times New Roman" w:hAnsi="Times New Roman"/>
-          <w:b w:val="0"/>
-          <w:i w:val="0"/>
-          <w:color w:val="000000"/>
           <w:sz w:val="20"/>
         </w:rPr>
-        <w:t>Altman, E. I. (1968). Financial Ratios, Discriminant Analysis and the Prediction of Corporate Bankruptcy. The Journal of Finance, 23(4), 589–609. https://doi.org/10.1111/j.1540-6261.1968.tb00843.x</w:t>
-      </w:r>
+        <w:t xml:space="preserve">Altman, E. I. (1968). Financial Ratios, Discriminant Analysis and the Prediction of Corporate Bankruptcy. The Journal of Finance, 23(4), 589–609. </w:t>
+      </w:r>
+      <w:hyperlink r:id="rId13">
+        <w:r>
+          <w:rPr>
+            <w:rFonts w:ascii="Times New Roman" w:hAnsi="Times New Roman"/>
+            <w:sz w:val="20"/>
+          </w:rPr>
+          <w:t>https://doi.org/10.1111/j.1540-6261.1968.tb00843.x</w:t>
+        </w:r>
+      </w:hyperlink>
     </w:p>
     <w:p>
       <w:pPr>
@@ -7035,13 +7053,19 @@
       <w:r>
         <w:rPr>
           <w:rFonts w:ascii="Times New Roman" w:hAnsi="Times New Roman"/>
-          <w:b w:val="0"/>
-          <w:i w:val="0"/>
-          <w:color w:val="000000"/>
           <w:sz w:val="20"/>
         </w:rPr>
-        <w:t>Beaver, W. H. (1966). Financial Ratios as Predictors of Failure. Journal of Accounting Research, 4, 71–111. https://doi.org/10.2307/2490171</w:t>
-      </w:r>
+        <w:t xml:space="preserve">Beaver, W. H. (1966). Financial Ratios as Predictors of Failure. Journal of Accounting Research, 4, 71–111. </w:t>
+      </w:r>
+      <w:hyperlink r:id="rId14">
+        <w:r>
+          <w:rPr>
+            <w:rFonts w:ascii="Times New Roman" w:hAnsi="Times New Roman"/>
+            <w:sz w:val="20"/>
+          </w:rPr>
+          <w:t>https://doi.org/10.2307/2490171</w:t>
+        </w:r>
+      </w:hyperlink>
     </w:p>
     <w:p>
       <w:pPr>
@@ -7054,13 +7078,19 @@
       <w:r>
         <w:rPr>
           <w:rFonts w:ascii="Times New Roman" w:hAnsi="Times New Roman"/>
-          <w:b w:val="0"/>
-          <w:i w:val="0"/>
-          <w:color w:val="000000"/>
           <w:sz w:val="20"/>
         </w:rPr>
-        <w:t>Campbell, J. Y., Hilscher, J., &amp; Szilagyi, J. (2008). In Search of Distress Risk [Abstract]. The Journal of Finance, 63(6), 2899–2939. https://doi.org/10.1111/j.1540-6261.2008.01416.x</w:t>
-      </w:r>
+        <w:t xml:space="preserve">Campbell, J. Y., Hilscher, J., &amp; Szilagyi, J. (2008). In Search of Distress Risk [Abstract]. The Journal of Finance, 63(6), 2899–2939. </w:t>
+      </w:r>
+      <w:hyperlink r:id="rId15">
+        <w:r>
+          <w:rPr>
+            <w:rFonts w:ascii="Times New Roman" w:hAnsi="Times New Roman"/>
+            <w:sz w:val="20"/>
+          </w:rPr>
+          <w:t>https://doi.org/10.1111/j.1540-6261.2008.01416.x</w:t>
+        </w:r>
+      </w:hyperlink>
     </w:p>
     <w:p>
       <w:pPr>
@@ -7073,13 +7103,19 @@
       <w:r>
         <w:rPr>
           <w:rFonts w:ascii="Times New Roman" w:hAnsi="Times New Roman"/>
-          <w:b w:val="0"/>
-          <w:i w:val="0"/>
-          <w:color w:val="000000"/>
           <w:sz w:val="20"/>
         </w:rPr>
-        <w:t>Che, W., Wang, Z., Jiang, C., &amp; Abedin, M. Z. (2024). Predicting Financial Distress Using Multimodal Data: An Attentive and Regularized Deep Learning Method. Information Processing &amp; Management, 61(4), 103703. https://doi.org/10.1016/j.ipm.2024.103703</w:t>
-      </w:r>
+        <w:t xml:space="preserve">Che, W., Wang, Z., Jiang, C., &amp; Abedin, M. Z. (2024). Predicting Financial Distress Using Multimodal Data: An Attentive and Regularized Deep Learning Method. Information Processing &amp; Management, 61(4), 103703. </w:t>
+      </w:r>
+      <w:hyperlink r:id="rId22">
+        <w:r>
+          <w:rPr>
+            <w:rFonts w:ascii="Times New Roman" w:hAnsi="Times New Roman"/>
+            <w:sz w:val="20"/>
+          </w:rPr>
+          <w:t>https://doi.org/10.1016/j.ipm.2024.103703</w:t>
+        </w:r>
+      </w:hyperlink>
     </w:p>
     <w:p>
       <w:pPr>
@@ -7092,13 +7128,19 @@
       <w:r>
         <w:rPr>
           <w:rFonts w:ascii="Times New Roman" w:hAnsi="Times New Roman"/>
-          <w:b w:val="0"/>
-          <w:i w:val="0"/>
-          <w:color w:val="000000"/>
           <w:sz w:val="20"/>
         </w:rPr>
-        <w:t>Hajek, P., &amp; Munk, M. (2024). Corporate Financial Distress Prediction Using the Risk-Related Information Content of Annual Reports [Abstract]. Information Processing &amp; Management, 61(5), 103820. https://doi.org/10.1016/j.ipm.2024.103820</w:t>
-      </w:r>
+        <w:t xml:space="preserve">Hajek, P., &amp; Munk, M. (2024). Corporate Financial Distress Prediction Using the Risk-Related Information Content of Annual Reports [Abstract]. Information Processing &amp; Management, 61(5), 103820. </w:t>
+      </w:r>
+      <w:hyperlink r:id="rId23">
+        <w:r>
+          <w:rPr>
+            <w:rFonts w:ascii="Times New Roman" w:hAnsi="Times New Roman"/>
+            <w:sz w:val="20"/>
+          </w:rPr>
+          <w:t>https://doi.org/10.1016/j.ipm.2024.103820</w:t>
+        </w:r>
+      </w:hyperlink>
     </w:p>
     <w:p>
       <w:pPr>
@@ -7111,13 +7153,19 @@
       <w:r>
         <w:rPr>
           <w:rFonts w:ascii="Times New Roman" w:hAnsi="Times New Roman"/>
-          <w:b w:val="0"/>
-          <w:i w:val="0"/>
-          <w:color w:val="000000"/>
           <w:sz w:val="20"/>
         </w:rPr>
-        <w:t>Jiang, C., Lyu, X., Yuan, Y., Wang, Z., &amp; Ding, Y. (2022). Mining Semantic Features in Current Reports for Financial Distress Prediction: Empirical Evidence from Unlisted Public Firms in China [Abstract]. International Journal of Forecasting, 38(3), 1086–1099. https://doi.org/10.1016/j.ijforecast.2021.06.011</w:t>
-      </w:r>
+        <w:t xml:space="preserve">Jiang, C., Lyu, X., Yuan, Y., Wang, Z., &amp; Ding, Y. (2022). Mining Semantic Features in Current Reports for Financial Distress Prediction: Empirical Evidence from Unlisted Public Firms in China [Abstract]. International Journal of Forecasting, 38(3), 1086–1099. </w:t>
+      </w:r>
+      <w:hyperlink r:id="rId24">
+        <w:r>
+          <w:rPr>
+            <w:rFonts w:ascii="Times New Roman" w:hAnsi="Times New Roman"/>
+            <w:sz w:val="20"/>
+          </w:rPr>
+          <w:t>https://doi.org/10.1016/j.ijforecast.2021.06.011</w:t>
+        </w:r>
+      </w:hyperlink>
     </w:p>
     <w:p>
       <w:pPr>
@@ -7130,13 +7178,19 @@
       <w:r>
         <w:rPr>
           <w:rFonts w:ascii="Times New Roman" w:hAnsi="Times New Roman"/>
-          <w:b w:val="0"/>
-          <w:i w:val="0"/>
-          <w:color w:val="000000"/>
           <w:sz w:val="20"/>
         </w:rPr>
-        <w:t>Kogan, S., Levin, D., Routledge, B. R., Sagi, J. S., &amp; Smith, N. A. (2009). Predicting Risk from Financial Reports with Regression. In Proceedings of Human Language Technologies: The 2009 Annual Conference of the North American Chapter of the ACL (pp. 272–280). Association for Computational Linguistics.</w:t>
-      </w:r>
+        <w:t xml:space="preserve">Kogan, S., Levin, D., Routledge, B. R., Sagi, J. S., &amp; Smith, N. A. (2009). Predicting Risk from Financial Reports with Regression. In Proceedings of Human Language Technologies: The 2009 Annual Conference of the North American Chapter of the ACL (pp. 272–280). Association for Computational Linguistics. </w:t>
+      </w:r>
+      <w:hyperlink r:id="rId25">
+        <w:r>
+          <w:rPr>
+            <w:rFonts w:ascii="Times New Roman" w:hAnsi="Times New Roman"/>
+            <w:sz w:val="20"/>
+          </w:rPr>
+          <w:t>https://aclanthology.org/N09-1031/</w:t>
+        </w:r>
+      </w:hyperlink>
     </w:p>
     <w:p>
       <w:pPr>
@@ -7149,13 +7203,19 @@
       <w:r>
         <w:rPr>
           <w:rFonts w:ascii="Times New Roman" w:hAnsi="Times New Roman"/>
-          <w:b w:val="0"/>
-          <w:i w:val="0"/>
-          <w:color w:val="000000"/>
           <w:sz w:val="20"/>
         </w:rPr>
-        <w:t>Loughran, T., &amp; McDonald, B. (2011). When Is a Liability Not a Liability? Textual Analysis, Dictionaries, and 10-Ks [Abstract]. The Journal of Finance, 66(1), 35–65. https://doi.org/10.1111/j.1540-6261.2010.01625.x</w:t>
-      </w:r>
+        <w:t xml:space="preserve">Loughran, T., &amp; McDonald, B. (2011). When Is a Liability Not a Liability? Textual Analysis, Dictionaries, and 10-Ks. The Journal of Finance, 66(1), 35–65. </w:t>
+      </w:r>
+      <w:hyperlink r:id="rId26">
+        <w:r>
+          <w:rPr>
+            <w:rFonts w:ascii="Times New Roman" w:hAnsi="Times New Roman"/>
+            <w:sz w:val="20"/>
+          </w:rPr>
+          <w:t>https://doi.org/10.1111/j.1540-6261.2010.01625.x</w:t>
+        </w:r>
+      </w:hyperlink>
     </w:p>
     <w:p>
       <w:pPr>
@@ -7168,13 +7228,19 @@
       <w:r>
         <w:rPr>
           <w:rFonts w:ascii="Times New Roman" w:hAnsi="Times New Roman"/>
-          <w:b w:val="0"/>
-          <w:i w:val="0"/>
-          <w:color w:val="000000"/>
           <w:sz w:val="20"/>
         </w:rPr>
-        <w:t>Mai, F., Tian, S., Lee, C., &amp; Ma, L. (2019). Deep Learning Models for Bankruptcy Prediction Using Textual Disclosures. European Journal of Operational Research, 274(2), 743–758. https://doi.org/10.1016/j.ejor.2018.10.024</w:t>
-      </w:r>
+        <w:t xml:space="preserve">Mai, F., Tian, S., Lee, C., &amp; Ma, L. (2019). Deep Learning Models for Bankruptcy Prediction Using Textual Disclosures. European Journal of Operational Research, 274(2), 743–758. </w:t>
+      </w:r>
+      <w:hyperlink r:id="rId27">
+        <w:r>
+          <w:rPr>
+            <w:rFonts w:ascii="Times New Roman" w:hAnsi="Times New Roman"/>
+            <w:sz w:val="20"/>
+          </w:rPr>
+          <w:t>https://doi.org/10.1016/j.ejor.2018.10.024</w:t>
+        </w:r>
+      </w:hyperlink>
     </w:p>
     <w:p>
       <w:pPr>
@@ -7187,13 +7253,19 @@
       <w:r>
         <w:rPr>
           <w:rFonts w:ascii="Times New Roman" w:hAnsi="Times New Roman"/>
-          <w:b w:val="0"/>
-          <w:i w:val="0"/>
-          <w:color w:val="000000"/>
           <w:sz w:val="20"/>
         </w:rPr>
-        <w:t>Matin, R., Hansen, C., Hansen, C., &amp; Mølgaard, P. (2018). Predicting Distresses Using Deep Learning of Text Segments in Annual Reports [Preprint]. arXiv:1811.05270. https://arxiv.org/abs/1811.05270</w:t>
-      </w:r>
+        <w:t xml:space="preserve">Matin, R., Hansen, C., Hansen, C., &amp; Mølgaard, P. (2018). Predicting Distresses Using Deep Learning of Text Segments in Annual Reports [Preprint]. arXiv:1811.05270. </w:t>
+      </w:r>
+      <w:hyperlink r:id="rId28">
+        <w:r>
+          <w:rPr>
+            <w:rFonts w:ascii="Times New Roman" w:hAnsi="Times New Roman"/>
+            <w:sz w:val="20"/>
+          </w:rPr>
+          <w:t>https://arxiv.org/abs/1811.05270</w:t>
+        </w:r>
+      </w:hyperlink>
     </w:p>
     <w:p>
       <w:pPr>
@@ -7206,13 +7278,19 @@
       <w:r>
         <w:rPr>
           <w:rFonts w:ascii="Times New Roman" w:hAnsi="Times New Roman"/>
-          <w:b w:val="0"/>
-          <w:i w:val="0"/>
-          <w:color w:val="000000"/>
           <w:sz w:val="20"/>
         </w:rPr>
-        <w:t>Ohlson, J. A. (1980). Financial Ratios and the Probabilistic Prediction of Bankruptcy. Journal of Accounting Research, 18(1), 109–131. https://doi.org/10.2307/2490395</w:t>
-      </w:r>
+        <w:t xml:space="preserve">Ohlson, J. A. (1980). Financial Ratios and the Probabilistic Prediction of Bankruptcy. Journal of Accounting Research, 18(1), 109–131. </w:t>
+      </w:r>
+      <w:hyperlink r:id="rId29">
+        <w:r>
+          <w:rPr>
+            <w:rFonts w:ascii="Times New Roman" w:hAnsi="Times New Roman"/>
+            <w:sz w:val="20"/>
+          </w:rPr>
+          <w:t>https://doi.org/10.2307/2490395</w:t>
+        </w:r>
+      </w:hyperlink>
     </w:p>
     <w:p>
       <w:pPr>
@@ -7225,13 +7303,19 @@
       <w:r>
         <w:rPr>
           <w:rFonts w:ascii="Times New Roman" w:hAnsi="Times New Roman"/>
-          <w:b w:val="0"/>
-          <w:i w:val="0"/>
-          <w:color w:val="000000"/>
           <w:sz w:val="20"/>
         </w:rPr>
-        <w:t>Shumway, T. (2001). Forecasting Bankruptcy More Accurately: A Simple Hazard Model. The Journal of Business, 74(1), 101–124. https://doi.org/10.1086/209665</w:t>
-      </w:r>
+        <w:t xml:space="preserve">Shumway, T. (2001). Forecasting Bankruptcy More Accurately: A Simple Hazard Model. The Journal of Business, 74(1), 101–124. </w:t>
+      </w:r>
+      <w:hyperlink r:id="rId30">
+        <w:r>
+          <w:rPr>
+            <w:rFonts w:ascii="Times New Roman" w:hAnsi="Times New Roman"/>
+            <w:sz w:val="20"/>
+          </w:rPr>
+          <w:t>https://doi.org/10.1086/209665</w:t>
+        </w:r>
+      </w:hyperlink>
     </w:p>
     <w:p>
       <w:pPr>
@@ -7244,13 +7328,19 @@
       <w:r>
         <w:rPr>
           <w:rFonts w:ascii="Times New Roman" w:hAnsi="Times New Roman"/>
-          <w:b w:val="0"/>
-          <w:i w:val="0"/>
-          <w:color w:val="000000"/>
           <w:sz w:val="20"/>
         </w:rPr>
-        <w:t>Vaswani, A., Shazeer, N., Parmar, N., Uszkoreit, J., Jones, L., Gomez, A. N., Kaiser, Ł., &amp; Polosukhin, I. (2017). Attention Is All You Need. In Advances in Neural Information Processing Systems 30 (pp. 5998–6008). Curran Associates.</w:t>
-      </w:r>
+        <w:t xml:space="preserve">Vaswani, A., Shazeer, N., Parmar, N., Uszkoreit, J., Jones, L., Gomez, A. N., Kaiser, Ł., &amp; Polosukhin, I. (2017). Attention Is All You Need. In Advances in Neural Information Processing Systems 30 (pp. 5998–6008). Curran Associates. </w:t>
+      </w:r>
+      <w:hyperlink r:id="rId31">
+        <w:r>
+          <w:rPr>
+            <w:rFonts w:ascii="Times New Roman" w:hAnsi="Times New Roman"/>
+            <w:sz w:val="20"/>
+          </w:rPr>
+          <w:t>https://proceedings.neurips.cc/paper/2017/hash/3f5ee243547dee91fbd053c1c4a845aa-Abstract.html</w:t>
+        </w:r>
+      </w:hyperlink>
     </w:p>
     <w:p>
       <w:pPr>
@@ -7263,13 +7353,19 @@
       <w:r>
         <w:rPr>
           <w:rFonts w:ascii="Times New Roman" w:hAnsi="Times New Roman"/>
-          <w:b w:val="0"/>
-          <w:i w:val="0"/>
-          <w:color w:val="000000"/>
           <w:sz w:val="20"/>
         </w:rPr>
-        <w:t>Zmijewski, M. E. (1984). Methodological Issues Related to the Estimation of Financial Distress Prediction Models. Journal of Accounting Research, 22, 59–82. https://doi.org/10.2307/2490859</w:t>
-      </w:r>
+        <w:t xml:space="preserve">Zmijewski, M. E. (1984). Methodological Issues Related to the Estimation of Financial Distress Prediction Models. Journal of Accounting Research, 22, 59–82. </w:t>
+      </w:r>
+      <w:hyperlink r:id="rId32">
+        <w:r>
+          <w:rPr>
+            <w:rFonts w:ascii="Times New Roman" w:hAnsi="Times New Roman"/>
+            <w:sz w:val="20"/>
+          </w:rPr>
+          <w:t>https://doi.org/10.2307/2490859</w:t>
+        </w:r>
+      </w:hyperlink>
     </w:p>
     <w:sectPr>
       <w:headerReference w:type="default" r:id="rId16"/>
@@ -7295,13 +7391,7 @@
         <w:pStyle w:val="CommentText"/>
       </w:pPr>
       <w:r>
-        <w:rPr>
-          <w:rStyle w:val="CommentReference"/>
-        </w:rPr>
-        <w:annotationRef/>
-      </w:r>
-      <w:r>
-        <w:t>Locator follow-up retained from the previous working manuscript: Campbell (2008), Hajek and Munk (2024), Jiang et al. (2022), and Loughran and McDonald (2011) are now limited to verified publisher abstracts and carry explicit Abstract/paragraph locators. Exact published-page locators have not been verified for these four. The supplied FIQ guide prefers page locators for paraphrases; obtain the paginated originals or confirm acceptance of electronic locators before final submission. All other cited passages have checked page locators. See Citation_Audit.csv.</w:t>
+        <w:t>Remaining locator checks: Campbell, Hilscher and Szilagyi (2008), Hajek and Munk (2024), and Jiang et al. (2022) are cited only for verified publisher-abstract claims, using Abstract, para. 1. Their exact printed-page locators remain unverified. The supplied FIQ citation guide recommends pages for paraphrases; obtain the paginated articles or confirm acceptance of electronic locators before submission. Loughran and McDonald (2011) has been resolved against printed page 35 and removed from this follow-up. All 14 reference links have been checked for matching source identity; three Wiley landing pages restrict automated access. See Citation_Audit.csv and Reference_Link_Audit.csv.</w:t>
       </w:r>
     </w:p>
   </w:comment>

</xml_diff>

<commit_message>
Improve Figure 4 readability with model panels and seed line patterns
</commit_message>
<xml_diff>
--- a/manuscript/Annual_ST_Manuscript.docx
+++ b/manuscript/Annual_ST_Manuscript.docx
@@ -5819,7 +5819,7 @@
       <w:r>
         <w:drawing>
           <wp:inline xmlns:a="http://schemas.openxmlformats.org/drawingml/2006/main" xmlns:pic="http://schemas.openxmlformats.org/drawingml/2006/picture">
-            <wp:extent cx="5832000" cy="3165943"/>
+            <wp:extent cx="5832000" cy="6831771"/>
             <wp:docPr id="4" name="Picture 4"/>
             <wp:cNvGraphicFramePr>
               <a:graphicFrameLocks noChangeAspect="1"/>
@@ -5840,7 +5840,7 @@
                   <pic:spPr>
                     <a:xfrm>
                       <a:off x="0" y="0"/>
-                      <a:ext cx="5832000" cy="3165943"/>
+                      <a:ext cx="5832000" cy="6831771"/>
                     </a:xfrm>
                     <a:prstGeom prst="rect"/>
                   </pic:spPr>
@@ -5866,7 +5866,7 @@
           <w:color w:val="000000"/>
           <w:sz w:val="22"/>
         </w:rPr>
-        <w:t>Source: Saved predictions. Line patterns identify models; grey tones identify neural seeds 17, 42 and 2026. All runs are shown. The PR reference is prevalence, 11/216.</w:t>
+        <w:t>Source: Saved test predictions. Rows and colours identify models; solid, dashed and dotted lines identify neural seeds 17, 42 and 2026. All 13 runs are shown on common axes. Grey references indicate prevalence (11/216) for PR and the diagonal for ROC.</w:t>
       </w:r>
     </w:p>
     <w:p>

</xml_diff>